<commit_message>
Replika Tableau V2 (riset help.tableau.com) + docx update
</commit_message>
<xml_diff>
--- a/Laporan_Tableau_Banyuwangi.docx
+++ b/Laporan_Tableau_Banyuwangi.docx
@@ -166,7 +166,7 @@
       <w:r>
         <w:drawing>
           <wp:inline xmlns:a="http://schemas.openxmlformats.org/drawingml/2006/main" xmlns:pic="http://schemas.openxmlformats.org/drawingml/2006/picture">
-            <wp:extent cx="5852160" cy="3901440"/>
+            <wp:extent cx="5852160" cy="3775587"/>
             <wp:docPr id="1" name="Picture 1"/>
             <wp:cNvGraphicFramePr>
               <a:graphicFrameLocks noChangeAspect="1"/>
@@ -187,7 +187,7 @@
                   <pic:spPr>
                     <a:xfrm>
                       <a:off x="0" y="0"/>
-                      <a:ext cx="5852160" cy="3901440"/>
+                      <a:ext cx="5852160" cy="3775587"/>
                     </a:xfrm>
                     <a:prstGeom prst="rect"/>
                   </pic:spPr>
@@ -988,7 +988,7 @@
       <w:r>
         <w:drawing>
           <wp:inline xmlns:a="http://schemas.openxmlformats.org/drawingml/2006/main" xmlns:pic="http://schemas.openxmlformats.org/drawingml/2006/picture">
-            <wp:extent cx="5669280" cy="2164171"/>
+            <wp:extent cx="5669280" cy="3320578"/>
             <wp:docPr id="8" name="Picture 8"/>
             <wp:cNvGraphicFramePr>
               <a:graphicFrameLocks noChangeAspect="1"/>
@@ -1009,7 +1009,7 @@
                   <pic:spPr>
                     <a:xfrm>
                       <a:off x="0" y="0"/>
-                      <a:ext cx="5669280" cy="2164171"/>
+                      <a:ext cx="5669280" cy="3320578"/>
                     </a:xfrm>
                     <a:prstGeom prst="rect"/>
                   </pic:spPr>
@@ -1057,7 +1057,7 @@
       <w:r>
         <w:drawing>
           <wp:inline xmlns:a="http://schemas.openxmlformats.org/drawingml/2006/main" xmlns:pic="http://schemas.openxmlformats.org/drawingml/2006/picture">
-            <wp:extent cx="5669280" cy="3427337"/>
+            <wp:extent cx="5669280" cy="3320578"/>
             <wp:docPr id="9" name="Picture 9"/>
             <wp:cNvGraphicFramePr>
               <a:graphicFrameLocks noChangeAspect="1"/>
@@ -1078,7 +1078,7 @@
                   <pic:spPr>
                     <a:xfrm>
                       <a:off x="0" y="0"/>
-                      <a:ext cx="5669280" cy="3427337"/>
+                      <a:ext cx="5669280" cy="3320578"/>
                     </a:xfrm>
                     <a:prstGeom prst="rect"/>
                   </pic:spPr>
@@ -1126,7 +1126,7 @@
       <w:r>
         <w:drawing>
           <wp:inline xmlns:a="http://schemas.openxmlformats.org/drawingml/2006/main" xmlns:pic="http://schemas.openxmlformats.org/drawingml/2006/picture">
-            <wp:extent cx="5669280" cy="3848239"/>
+            <wp:extent cx="5669280" cy="3320578"/>
             <wp:docPr id="10" name="Picture 10"/>
             <wp:cNvGraphicFramePr>
               <a:graphicFrameLocks noChangeAspect="1"/>
@@ -1147,7 +1147,7 @@
                   <pic:spPr>
                     <a:xfrm>
                       <a:off x="0" y="0"/>
-                      <a:ext cx="5669280" cy="3848239"/>
+                      <a:ext cx="5669280" cy="3320578"/>
                     </a:xfrm>
                     <a:prstGeom prst="rect"/>
                   </pic:spPr>
@@ -1195,7 +1195,7 @@
       <w:r>
         <w:drawing>
           <wp:inline xmlns:a="http://schemas.openxmlformats.org/drawingml/2006/main" xmlns:pic="http://schemas.openxmlformats.org/drawingml/2006/picture">
-            <wp:extent cx="5669280" cy="3427337"/>
+            <wp:extent cx="5669280" cy="3320578"/>
             <wp:docPr id="11" name="Picture 11"/>
             <wp:cNvGraphicFramePr>
               <a:graphicFrameLocks noChangeAspect="1"/>
@@ -1216,7 +1216,7 @@
                   <pic:spPr>
                     <a:xfrm>
                       <a:off x="0" y="0"/>
-                      <a:ext cx="5669280" cy="3427337"/>
+                      <a:ext cx="5669280" cy="3320578"/>
                     </a:xfrm>
                     <a:prstGeom prst="rect"/>
                   </pic:spPr>

</xml_diff>